<commit_message>
Improve arena rumble lesson
</commit_message>
<xml_diff>
--- a/CourseMaterials/03_functions/02_arena_rumble/arena_rumble.docx
+++ b/CourseMaterials/03_functions/02_arena_rumble/arena_rumble.docx
@@ -104,21 +104,21 @@
           <w:color w:val="000000"/>
           <w:highlight w:val="lightGray"/>
         </w:rPr>
-        <w:t>pick random</w:t>
+        <w:t>go to random position</w:t>
       </w:r>
       <w:r>
         <w:rPr>
           <w:rFonts w:ascii="Garamond" w:hAnsi="Garamond"/>
           <w:color w:val="000000"/>
         </w:rPr>
-        <w:t xml:space="preserve"> block to complete the project</w:t>
+        <w:t xml:space="preserve"> b</w:t>
       </w:r>
       <w:r>
         <w:rPr>
           <w:rFonts w:ascii="Garamond" w:hAnsi="Garamond"/>
           <w:color w:val="000000"/>
         </w:rPr>
-        <w:t>.</w:t>
+        <w:t>lock to complete the project.</w:t>
       </w:r>
       <w:r>
         <w:rPr>
@@ -270,7 +270,19 @@
         <w:rPr>
           <w:rFonts w:ascii="Garamond" w:hAnsi="Garamond"/>
         </w:rPr>
-        <w:t>Starts at a random x and random y coordinate at the start of every game</w:t>
+        <w:t xml:space="preserve">Starts at a random </w:t>
+      </w:r>
+      <w:r>
+        <w:rPr>
+          <w:rFonts w:ascii="Garamond" w:hAnsi="Garamond"/>
+        </w:rPr>
+        <w:t>position</w:t>
+      </w:r>
+      <w:r>
+        <w:rPr>
+          <w:rFonts w:ascii="Garamond" w:hAnsi="Garamond"/>
+        </w:rPr>
+        <w:t xml:space="preserve"> at the start of every game</w:t>
       </w:r>
     </w:p>
     <w:p>
@@ -284,7 +296,13 @@
         <w:rPr>
           <w:rFonts w:ascii="Garamond" w:hAnsi="Garamond"/>
         </w:rPr>
-        <w:t>Ability to move forward when holding the space bar</w:t>
+        <w:t xml:space="preserve">Ability to move forward when holding </w:t>
+      </w:r>
+      <w:r>
+        <w:rPr>
+          <w:rFonts w:ascii="Garamond" w:hAnsi="Garamond"/>
+        </w:rPr>
+        <w:t>up arrow</w:t>
       </w:r>
     </w:p>
     <w:p>
@@ -350,7 +368,19 @@
         <w:rPr>
           <w:rFonts w:ascii="Garamond" w:hAnsi="Garamond"/>
         </w:rPr>
-        <w:t>Starts at a random x and random y coordinate at the start of every game</w:t>
+        <w:t xml:space="preserve">Starts at a random </w:t>
+      </w:r>
+      <w:r>
+        <w:rPr>
+          <w:rFonts w:ascii="Garamond" w:hAnsi="Garamond"/>
+        </w:rPr>
+        <w:t>position</w:t>
+      </w:r>
+      <w:r>
+        <w:rPr>
+          <w:rFonts w:ascii="Garamond" w:hAnsi="Garamond"/>
+        </w:rPr>
+        <w:t xml:space="preserve"> at the start of every game</w:t>
       </w:r>
     </w:p>
     <w:p>
@@ -381,7 +411,19 @@
         <w:rPr>
           <w:rFonts w:ascii="Garamond" w:hAnsi="Garamond"/>
         </w:rPr>
-        <w:t>Jumps to a random spot whenever a player collides with it</w:t>
+        <w:t xml:space="preserve">Jumps to a random </w:t>
+      </w:r>
+      <w:r>
+        <w:rPr>
+          <w:rFonts w:ascii="Garamond" w:hAnsi="Garamond"/>
+        </w:rPr>
+        <w:t>position</w:t>
+      </w:r>
+      <w:r>
+        <w:rPr>
+          <w:rFonts w:ascii="Garamond" w:hAnsi="Garamond"/>
+        </w:rPr>
+        <w:t xml:space="preserve"> whenever a player collides with it</w:t>
       </w:r>
     </w:p>
     <w:p/>
@@ -430,7 +472,19 @@
         <w:rPr>
           <w:rFonts w:ascii="Garamond" w:hAnsi="Garamond"/>
         </w:rPr>
-        <w:t>Starts at a random x and random y coordinate at the start of every game</w:t>
+        <w:t xml:space="preserve">Starts at a random </w:t>
+      </w:r>
+      <w:r>
+        <w:rPr>
+          <w:rFonts w:ascii="Garamond" w:hAnsi="Garamond"/>
+        </w:rPr>
+        <w:t>position</w:t>
+      </w:r>
+      <w:r>
+        <w:rPr>
+          <w:rFonts w:ascii="Garamond" w:hAnsi="Garamond"/>
+        </w:rPr>
+        <w:t xml:space="preserve"> at the start of every game</w:t>
       </w:r>
     </w:p>
     <w:p>
@@ -522,7 +576,19 @@
         <w:rPr>
           <w:rFonts w:ascii="Garamond" w:hAnsi="Garamond"/>
         </w:rPr>
-        <w:t>Jumps to a random spot whenever a player collides with it</w:t>
+        <w:t xml:space="preserve">Jumps to a random </w:t>
+      </w:r>
+      <w:r>
+        <w:rPr>
+          <w:rFonts w:ascii="Garamond" w:hAnsi="Garamond"/>
+        </w:rPr>
+        <w:t>position</w:t>
+      </w:r>
+      <w:r>
+        <w:rPr>
+          <w:rFonts w:ascii="Garamond" w:hAnsi="Garamond"/>
+        </w:rPr>
+        <w:t xml:space="preserve"> whenever a player collides with it</w:t>
       </w:r>
     </w:p>
     <w:p>
@@ -544,7 +610,6 @@
     </w:p>
     <w:p>
       <w:pPr>
-        <w:ind w:firstLine="540"/>
         <w:rPr>
           <w:rFonts w:ascii="Garamond" w:hAnsi="Garamond"/>
         </w:rPr>
@@ -660,13 +725,7 @@
         <w:rPr>
           <w:rFonts w:ascii="Garamond" w:hAnsi="Garamond"/>
         </w:rPr>
-        <w:t xml:space="preserve"> a </w:t>
-      </w:r>
-      <w:r>
-        <w:rPr>
-          <w:rFonts w:ascii="Garamond" w:hAnsi="Garamond"/>
-        </w:rPr>
-        <w:t>speed boost (hint: player_1_speed variable) (3pts)</w:t>
+        <w:t xml:space="preserve"> a speed boost (hint: player_1_speed variable) (3pts)</w:t>
       </w:r>
     </w:p>
     <w:p>

</xml_diff>

<commit_message>
Finalized Arena Rumble _after_ variables 2 worksheet
</commit_message>
<xml_diff>
--- a/CourseMaterials/03_functions/02_arena_rumble/arena_rumble.docx
+++ b/CourseMaterials/03_functions/02_arena_rumble/arena_rumble.docx
@@ -69,27 +69,45 @@
         <w:rPr>
           <w:rFonts w:ascii="Garamond" w:hAnsi="Garamond"/>
         </w:rPr>
-        <w:t>You will do this by combining the “game loop algorithm” with variables to have various sprites(s) react various types of collisions.</w:t>
-      </w:r>
-    </w:p>
-    <w:p>
-      <w:pPr>
-        <w:rPr>
-          <w:rFonts w:ascii="Garamond" w:hAnsi="Garamond"/>
-        </w:rPr>
-      </w:pPr>
-    </w:p>
-    <w:p>
-      <w:pPr>
-        <w:rPr>
-          <w:rFonts w:ascii="Garamond" w:hAnsi="Garamond"/>
-        </w:rPr>
-      </w:pPr>
-      <w:r>
-        <w:rPr>
-          <w:rFonts w:ascii="Garamond" w:hAnsi="Garamond"/>
-        </w:rPr>
-        <w:t xml:space="preserve">In the process, you will be using variables and </w:t>
+        <w:t xml:space="preserve">You will do this by combining the “game loop algorithm” with variables to have various sprites(s) react </w:t>
+      </w:r>
+      <w:r>
+        <w:rPr>
+          <w:rFonts w:ascii="Garamond" w:hAnsi="Garamond"/>
+        </w:rPr>
+        <w:t xml:space="preserve">to </w:t>
+      </w:r>
+      <w:r>
+        <w:rPr>
+          <w:rFonts w:ascii="Garamond" w:hAnsi="Garamond"/>
+        </w:rPr>
+        <w:t>various types of collisions.</w:t>
+      </w:r>
+    </w:p>
+    <w:p>
+      <w:pPr>
+        <w:rPr>
+          <w:rFonts w:ascii="Garamond" w:hAnsi="Garamond"/>
+        </w:rPr>
+      </w:pPr>
+    </w:p>
+    <w:p>
+      <w:pPr>
+        <w:rPr>
+          <w:rFonts w:ascii="Garamond" w:hAnsi="Garamond"/>
+        </w:rPr>
+      </w:pPr>
+      <w:r>
+        <w:rPr>
+          <w:rFonts w:ascii="Garamond" w:hAnsi="Garamond"/>
+        </w:rPr>
+        <w:t>Y</w:t>
+      </w:r>
+      <w:r>
+        <w:rPr>
+          <w:rFonts w:ascii="Garamond" w:hAnsi="Garamond"/>
+        </w:rPr>
+        <w:t xml:space="preserve">ou will be using variables and </w:t>
       </w:r>
       <w:r>
         <w:rPr>
@@ -130,7 +148,13 @@
         <w:rPr>
           <w:rFonts w:ascii="Garamond" w:hAnsi="Garamond"/>
         </w:rPr>
-        <w:t xml:space="preserve">In total, your game will consist </w:t>
+        <w:t>Y</w:t>
+      </w:r>
+      <w:r>
+        <w:rPr>
+          <w:rFonts w:ascii="Garamond" w:hAnsi="Garamond"/>
+        </w:rPr>
+        <w:t xml:space="preserve">our game will consist </w:t>
       </w:r>
       <w:r>
         <w:rPr>
@@ -142,7 +166,7 @@
         <w:rPr>
           <w:rFonts w:ascii="Garamond" w:hAnsi="Garamond"/>
         </w:rPr>
-        <w:t>at least four</w:t>
+        <w:t>four</w:t>
       </w:r>
       <w:r>
         <w:rPr>
@@ -270,19 +294,13 @@
         <w:rPr>
           <w:rFonts w:ascii="Garamond" w:hAnsi="Garamond"/>
         </w:rPr>
-        <w:t xml:space="preserve">Starts at a random </w:t>
-      </w:r>
-      <w:r>
-        <w:rPr>
-          <w:rFonts w:ascii="Garamond" w:hAnsi="Garamond"/>
-        </w:rPr>
-        <w:t>position</w:t>
-      </w:r>
-      <w:r>
-        <w:rPr>
-          <w:rFonts w:ascii="Garamond" w:hAnsi="Garamond"/>
-        </w:rPr>
-        <w:t xml:space="preserve"> at the start of every game</w:t>
+        <w:t xml:space="preserve">Starts </w:t>
+      </w:r>
+      <w:r>
+        <w:rPr>
+          <w:rFonts w:ascii="Garamond" w:hAnsi="Garamond"/>
+        </w:rPr>
+        <w:t>in the same position and points in the same direction at the start of every game</w:t>
       </w:r>
     </w:p>
     <w:p>
@@ -296,7 +314,25 @@
         <w:rPr>
           <w:rFonts w:ascii="Garamond" w:hAnsi="Garamond"/>
         </w:rPr>
-        <w:t xml:space="preserve">Ability to move forward when holding </w:t>
+        <w:t>M</w:t>
+      </w:r>
+      <w:r>
+        <w:rPr>
+          <w:rFonts w:ascii="Garamond" w:hAnsi="Garamond"/>
+        </w:rPr>
+        <w:t>ove</w:t>
+      </w:r>
+      <w:r>
+        <w:rPr>
+          <w:rFonts w:ascii="Garamond" w:hAnsi="Garamond"/>
+        </w:rPr>
+        <w:t>s</w:t>
+      </w:r>
+      <w:r>
+        <w:rPr>
+          <w:rFonts w:ascii="Garamond" w:hAnsi="Garamond"/>
+        </w:rPr>
+        <w:t xml:space="preserve"> forward when holding </w:t>
       </w:r>
       <w:r>
         <w:rPr>
@@ -319,7 +355,25 @@
         <w:rPr>
           <w:rFonts w:ascii="Garamond" w:hAnsi="Garamond"/>
         </w:rPr>
-        <w:t>Ability to turn left/right when holding the left/right arrow keys</w:t>
+        <w:t>T</w:t>
+      </w:r>
+      <w:r>
+        <w:rPr>
+          <w:rFonts w:ascii="Garamond" w:hAnsi="Garamond"/>
+        </w:rPr>
+        <w:t>urn</w:t>
+      </w:r>
+      <w:r>
+        <w:rPr>
+          <w:rFonts w:ascii="Garamond" w:hAnsi="Garamond"/>
+        </w:rPr>
+        <w:t>s</w:t>
+      </w:r>
+      <w:r>
+        <w:rPr>
+          <w:rFonts w:ascii="Garamond" w:hAnsi="Garamond"/>
+        </w:rPr>
+        <w:t xml:space="preserve"> left/right when holding the left/right arrow keys</w:t>
       </w:r>
     </w:p>
     <w:p/>
@@ -556,7 +610,31 @@
         <w:rPr>
           <w:rFonts w:ascii="Garamond" w:hAnsi="Garamond"/>
         </w:rPr>
-        <w:t xml:space="preserve">s life whenever it collides with </w:t>
+        <w:t>s li</w:t>
+      </w:r>
+      <w:r>
+        <w:rPr>
+          <w:rFonts w:ascii="Garamond" w:hAnsi="Garamond"/>
+        </w:rPr>
+        <w:t>v</w:t>
+      </w:r>
+      <w:r>
+        <w:rPr>
+          <w:rFonts w:ascii="Garamond" w:hAnsi="Garamond"/>
+        </w:rPr>
+        <w:t>e</w:t>
+      </w:r>
+      <w:r>
+        <w:rPr>
+          <w:rFonts w:ascii="Garamond" w:hAnsi="Garamond"/>
+        </w:rPr>
+        <w:t>s</w:t>
+      </w:r>
+      <w:r>
+        <w:rPr>
+          <w:rFonts w:ascii="Garamond" w:hAnsi="Garamond"/>
+        </w:rPr>
+        <w:t xml:space="preserve"> whenever it collides with </w:t>
       </w:r>
       <w:r>
         <w:rPr>
@@ -588,7 +666,13 @@
         <w:rPr>
           <w:rFonts w:ascii="Garamond" w:hAnsi="Garamond"/>
         </w:rPr>
-        <w:t xml:space="preserve"> whenever a player collides with it</w:t>
+        <w:t xml:space="preserve"> whenever </w:t>
+      </w:r>
+      <w:r>
+        <w:rPr>
+          <w:rFonts w:ascii="Garamond" w:hAnsi="Garamond"/>
+        </w:rPr>
+        <w:t>it collides with a player</w:t>
       </w:r>
     </w:p>
     <w:p>

</xml_diff>

<commit_message>
Add pacing and improve area rumble lessons
</commit_message>
<xml_diff>
--- a/CourseMaterials/03_functions/02_arena_rumble/arena_rumble.docx
+++ b/CourseMaterials/03_functions/02_arena_rumble/arena_rumble.docx
@@ -93,6 +93,68 @@
     </w:p>
     <w:p>
       <w:pPr>
+        <w:jc w:val="center"/>
+        <w:rPr>
+          <w:rFonts w:ascii="Garamond" w:hAnsi="Garamond"/>
+        </w:rPr>
+      </w:pPr>
+      <w:r>
+        <w:rPr>
+          <w:rFonts w:ascii="Garamond" w:hAnsi="Garamond"/>
+          <w:noProof/>
+        </w:rPr>
+        <w:drawing>
+          <wp:inline distT="0" distB="0" distL="0" distR="0" wp14:anchorId="08EC19C8" wp14:editId="709C90FE">
+            <wp:extent cx="1868158" cy="1409700"/>
+            <wp:effectExtent l="0" t="0" r="0" b="0"/>
+            <wp:docPr id="457998521" name="Picture 3" descr="A screenshot of a video game&#10;&#10;AI-generated content may be incorrect."/>
+            <wp:cNvGraphicFramePr>
+              <a:graphicFrameLocks xmlns:a="http://schemas.openxmlformats.org/drawingml/2006/main" noChangeAspect="1"/>
+            </wp:cNvGraphicFramePr>
+            <a:graphic xmlns:a="http://schemas.openxmlformats.org/drawingml/2006/main">
+              <a:graphicData uri="http://schemas.openxmlformats.org/drawingml/2006/picture">
+                <pic:pic xmlns:pic="http://schemas.openxmlformats.org/drawingml/2006/picture">
+                  <pic:nvPicPr>
+                    <pic:cNvPr id="457998521" name="Picture 3" descr="A screenshot of a video game&#10;&#10;AI-generated content may be incorrect."/>
+                    <pic:cNvPicPr/>
+                  </pic:nvPicPr>
+                  <pic:blipFill>
+                    <a:blip r:embed="rId5" cstate="print">
+                      <a:extLst>
+                        <a:ext uri="{28A0092B-C50C-407E-A947-70E740481C1C}">
+                          <a14:useLocalDpi xmlns:a14="http://schemas.microsoft.com/office/drawing/2010/main" val="0"/>
+                        </a:ext>
+                      </a:extLst>
+                    </a:blip>
+                    <a:stretch>
+                      <a:fillRect/>
+                    </a:stretch>
+                  </pic:blipFill>
+                  <pic:spPr>
+                    <a:xfrm>
+                      <a:off x="0" y="0"/>
+                      <a:ext cx="1919759" cy="1448638"/>
+                    </a:xfrm>
+                    <a:prstGeom prst="rect">
+                      <a:avLst/>
+                    </a:prstGeom>
+                  </pic:spPr>
+                </pic:pic>
+              </a:graphicData>
+            </a:graphic>
+          </wp:inline>
+        </w:drawing>
+      </w:r>
+    </w:p>
+    <w:p>
+      <w:pPr>
+        <w:rPr>
+          <w:rFonts w:ascii="Garamond" w:hAnsi="Garamond"/>
+        </w:rPr>
+      </w:pPr>
+    </w:p>
+    <w:p>
+      <w:pPr>
         <w:rPr>
           <w:rFonts w:ascii="Garamond" w:hAnsi="Garamond"/>
         </w:rPr>
@@ -694,13 +756,6 @@
     </w:p>
     <w:p>
       <w:pPr>
-        <w:rPr>
-          <w:rFonts w:ascii="Garamond" w:hAnsi="Garamond"/>
-        </w:rPr>
-      </w:pPr>
-    </w:p>
-    <w:p>
-      <w:pPr>
         <w:pBdr>
           <w:bottom w:val="double" w:sz="6" w:space="1" w:color="auto"/>
         </w:pBdr>
@@ -756,13 +811,16 @@
         </w:rPr>
       </w:pPr>
       <w:r>
-        <w:t xml:space="preserve">□ </w:t>
-      </w:r>
-      <w:r>
-        <w:rPr>
-          <w:rFonts w:ascii="Garamond" w:hAnsi="Garamond"/>
-        </w:rPr>
-        <w:t xml:space="preserve">Have the game last </w:t>
+        <w:rPr>
+          <w:rFonts w:ascii="Garamond" w:hAnsi="Garamond"/>
+        </w:rPr>
+        <w:t>1. H</w:t>
+      </w:r>
+      <w:r>
+        <w:rPr>
+          <w:rFonts w:ascii="Garamond" w:hAnsi="Garamond"/>
+        </w:rPr>
+        <w:t xml:space="preserve">ave the game last </w:t>
       </w:r>
       <w:r>
         <w:rPr>
@@ -785,7 +843,48 @@
         </w:rPr>
       </w:pPr>
       <w:r>
-        <w:t xml:space="preserve">□ </w:t>
+        <w:rPr>
+          <w:rFonts w:ascii="Garamond" w:hAnsi="Garamond"/>
+        </w:rPr>
+        <w:t xml:space="preserve">2. </w:t>
+      </w:r>
+      <w:r>
+        <w:rPr>
+          <w:rFonts w:ascii="Garamond" w:hAnsi="Garamond"/>
+        </w:rPr>
+        <w:t xml:space="preserve">Create a sprite that leads to an “instant loss” for whatever player touches it </w:t>
+      </w:r>
+      <w:r>
+        <w:rPr>
+          <w:rFonts w:ascii="Garamond" w:hAnsi="Garamond"/>
+        </w:rPr>
+        <w:t>(</w:t>
+      </w:r>
+      <w:r>
+        <w:rPr>
+          <w:rFonts w:ascii="Garamond" w:hAnsi="Garamond"/>
+        </w:rPr>
+        <w:t>3</w:t>
+      </w:r>
+      <w:r>
+        <w:rPr>
+          <w:rFonts w:ascii="Garamond" w:hAnsi="Garamond"/>
+        </w:rPr>
+        <w:t>pts)</w:t>
+      </w:r>
+    </w:p>
+    <w:p>
+      <w:pPr>
+        <w:ind w:firstLine="540"/>
+        <w:rPr>
+          <w:rFonts w:ascii="Garamond" w:hAnsi="Garamond"/>
+        </w:rPr>
+      </w:pPr>
+      <w:r>
+        <w:rPr>
+          <w:rFonts w:ascii="Garamond" w:hAnsi="Garamond"/>
+        </w:rPr>
+        <w:t xml:space="preserve">3. </w:t>
       </w:r>
       <w:r>
         <w:rPr>
@@ -820,19 +919,16 @@
         </w:rPr>
       </w:pPr>
       <w:r>
-        <w:t xml:space="preserve">□ </w:t>
-      </w:r>
-      <w:r>
-        <w:rPr>
-          <w:rFonts w:ascii="Garamond" w:hAnsi="Garamond"/>
-        </w:rPr>
-        <w:t>Create a “start screen” and an “end screen”</w:t>
-      </w:r>
-      <w:r>
-        <w:rPr>
-          <w:rFonts w:ascii="Garamond" w:hAnsi="Garamond"/>
-        </w:rPr>
-        <w:t xml:space="preserve"> (3pts)</w:t>
+        <w:rPr>
+          <w:rFonts w:ascii="Garamond" w:hAnsi="Garamond"/>
+        </w:rPr>
+        <w:t>4. I</w:t>
+      </w:r>
+      <w:r>
+        <w:rPr>
+          <w:rFonts w:ascii="Garamond" w:hAnsi="Garamond"/>
+        </w:rPr>
+        <w:t>mplement the concept of a “turning radius” so players can’t turn without moving (3pts)</w:t>
       </w:r>
     </w:p>
     <w:p>
@@ -843,13 +939,16 @@
         </w:rPr>
       </w:pPr>
       <w:r>
-        <w:t xml:space="preserve">□ </w:t>
-      </w:r>
-      <w:r>
-        <w:rPr>
-          <w:rFonts w:ascii="Garamond" w:hAnsi="Garamond"/>
-        </w:rPr>
-        <w:t>Implement the concept of a “turning radius” so players can’t turn without moving (3pts)</w:t>
+        <w:rPr>
+          <w:rFonts w:ascii="Garamond" w:hAnsi="Garamond"/>
+        </w:rPr>
+        <w:t xml:space="preserve">5. </w:t>
+      </w:r>
+      <w:r>
+        <w:rPr>
+          <w:rFonts w:ascii="Garamond" w:hAnsi="Garamond"/>
+        </w:rPr>
+        <w:t>Allow players to play three rounds and determine the winner off most rounds won (5pts)</w:t>
       </w:r>
     </w:p>
     <w:p>
@@ -859,18 +958,65 @@
           <w:rFonts w:ascii="Garamond" w:hAnsi="Garamond"/>
         </w:rPr>
       </w:pPr>
-      <w:r>
-        <w:t xml:space="preserve">□ </w:t>
-      </w:r>
-      <w:r>
-        <w:rPr>
-          <w:rFonts w:ascii="Garamond" w:hAnsi="Garamond"/>
-        </w:rPr>
-        <w:t>Allow players to play three rounds and determine the winner off most rounds won (5pts)</w:t>
+    </w:p>
+    <w:p>
+      <w:pPr>
+        <w:ind w:firstLine="540"/>
+        <w:jc w:val="center"/>
+        <w:rPr>
+          <w:rFonts w:ascii="Garamond" w:hAnsi="Garamond"/>
+        </w:rPr>
+      </w:pPr>
+      <w:r>
+        <w:rPr>
+          <w:rFonts w:ascii="Garamond" w:hAnsi="Garamond"/>
+          <w:noProof/>
+        </w:rPr>
+        <w:drawing>
+          <wp:inline distT="0" distB="0" distL="0" distR="0" wp14:anchorId="10A35EAF" wp14:editId="4A4FCF64">
+            <wp:extent cx="3657600" cy="1109394"/>
+            <wp:effectExtent l="0" t="0" r="0" b="0"/>
+            <wp:docPr id="1786451194" name="Picture 2" descr="A diagram of a diagram&#10;&#10;AI-generated content may be incorrect."/>
+            <wp:cNvGraphicFramePr>
+              <a:graphicFrameLocks xmlns:a="http://schemas.openxmlformats.org/drawingml/2006/main" noChangeAspect="1"/>
+            </wp:cNvGraphicFramePr>
+            <a:graphic xmlns:a="http://schemas.openxmlformats.org/drawingml/2006/main">
+              <a:graphicData uri="http://schemas.openxmlformats.org/drawingml/2006/picture">
+                <pic:pic xmlns:pic="http://schemas.openxmlformats.org/drawingml/2006/picture">
+                  <pic:nvPicPr>
+                    <pic:cNvPr id="1786451194" name="Picture 2" descr="A diagram of a diagram&#10;&#10;AI-generated content may be incorrect."/>
+                    <pic:cNvPicPr/>
+                  </pic:nvPicPr>
+                  <pic:blipFill>
+                    <a:blip r:embed="rId6">
+                      <a:extLst>
+                        <a:ext uri="{28A0092B-C50C-407E-A947-70E740481C1C}">
+                          <a14:useLocalDpi xmlns:a14="http://schemas.microsoft.com/office/drawing/2010/main" val="0"/>
+                        </a:ext>
+                      </a:extLst>
+                    </a:blip>
+                    <a:stretch>
+                      <a:fillRect/>
+                    </a:stretch>
+                  </pic:blipFill>
+                  <pic:spPr>
+                    <a:xfrm>
+                      <a:off x="0" y="0"/>
+                      <a:ext cx="3756470" cy="1139382"/>
+                    </a:xfrm>
+                    <a:prstGeom prst="rect">
+                      <a:avLst/>
+                    </a:prstGeom>
+                  </pic:spPr>
+                </pic:pic>
+              </a:graphicData>
+            </a:graphic>
+          </wp:inline>
+        </w:drawing>
       </w:r>
     </w:p>
     <w:sectPr>
-      <w:pgSz w:w="12240" w:h="15840"/>
+      <w:pgSz w:w="12240" w:h="20160"/>
       <w:pgMar w:top="1440" w:right="1440" w:bottom="1440" w:left="1440" w:header="720" w:footer="720" w:gutter="0"/>
       <w:cols w:space="720"/>
       <w:docGrid w:linePitch="360"/>
@@ -1720,6 +1866,9 @@
   <w:style w:type="paragraph" w:default="1" w:styleId="Normal">
     <w:name w:val="Normal"/>
     <w:qFormat/>
+    <w:rPr>
+      <w:rFonts w:eastAsiaTheme="minorEastAsia"/>
+    </w:rPr>
   </w:style>
   <w:style w:type="character" w:default="1" w:styleId="DefaultParagraphFont">
     <w:name w:val="Default Paragraph Font"/>

</xml_diff>